<commit_message>
feat(intervention): distinguer champs demande/clôture et n° de bon d'affichage.
Les variables de formulaire se saisissent à la demande ou à la clôture ; un n° de bon vide n'est plus persisté comme « Pas de bon ».

Co-authored-by: Cursor <cursoragent@cursor.com>
</commit_message>
<xml_diff>
--- a/public/templates/intervention-template.docx
+++ b/public/templates/intervention-template.docx
@@ -17,12 +17,15 @@
         <w:tblLook w:val="04A0" w:firstRow="1" w:lastRow="0" w:firstColumn="1" w:lastColumn="0" w:noHBand="0" w:noVBand="1"/>
       </w:tblPr>
       <w:tblGrid>
-        <w:gridCol w:w="3485"/>
-        <w:gridCol w:w="1743"/>
-        <w:gridCol w:w="1742"/>
-        <w:gridCol w:w="3486"/>
+        <w:gridCol w:w="2614"/>
+        <w:gridCol w:w="2614"/>
+        <w:gridCol w:w="2614"/>
+        <w:gridCol w:w="2614"/>
       </w:tblGrid>
       <w:tr>
+        <w:trPr>
+          <w:trHeight w:val="586"/>
+        </w:trPr>
         <w:tc>
           <w:tcPr>
             <w:tcW w:w="5228" w:type="dxa"/>
@@ -45,17 +48,24 @@
               <w:t xml:space="preserve"> l’intervention</w:t>
             </w:r>
             <w:r>
-              <w:t> :</w:t>
-            </w:r>
-            <w:r>
-              <w:t xml:space="preserve"> </w:t>
-            </w:r>
+              <w:t xml:space="preserve"> : </w:t>
+            </w:r>
+          </w:p>
+          <w:p>
+            <w:pPr>
+              <w:jc w:val="center"/>
+            </w:pPr>
             <w:r>
               <w:t>{</w:t>
             </w:r>
             <w:proofErr w:type="spellStart"/>
-            <w:r>
-              <w:t>dateDemande</w:t>
+            <w:proofErr w:type="gramStart"/>
+            <w:r>
+              <w:t>date</w:t>
+            </w:r>
+            <w:proofErr w:type="gramEnd"/>
+            <w:r>
+              <w:t>_demande</w:t>
             </w:r>
             <w:proofErr w:type="spellEnd"/>
             <w:r>
@@ -80,12 +90,22 @@
             <w:r>
               <w:t xml:space="preserve"> : </w:t>
             </w:r>
+          </w:p>
+          <w:p>
+            <w:pPr>
+              <w:jc w:val="center"/>
+            </w:pPr>
             <w:r>
               <w:t>{</w:t>
             </w:r>
             <w:proofErr w:type="spellStart"/>
-            <w:r>
-              <w:t>heureDemande</w:t>
+            <w:proofErr w:type="gramStart"/>
+            <w:r>
+              <w:t>heure</w:t>
+            </w:r>
+            <w:proofErr w:type="gramEnd"/>
+            <w:r>
+              <w:t>_demande</w:t>
             </w:r>
             <w:proofErr w:type="spellEnd"/>
             <w:r>
@@ -95,6 +115,9 @@
         </w:tc>
       </w:tr>
       <w:tr>
+        <w:trPr>
+          <w:trHeight w:val="586"/>
+        </w:trPr>
         <w:tc>
           <w:tcPr>
             <w:tcW w:w="10456" w:type="dxa"/>
@@ -110,10 +133,7 @@
               <w:t>Site</w:t>
             </w:r>
             <w:r>
-              <w:t xml:space="preserve"> :</w:t>
-            </w:r>
-            <w:r>
-              <w:t xml:space="preserve"> </w:t>
+              <w:t xml:space="preserve"> : </w:t>
             </w:r>
             <w:r>
               <w:t>{site}</w:t>
@@ -122,6 +142,9 @@
         </w:tc>
       </w:tr>
       <w:tr>
+        <w:trPr>
+          <w:trHeight w:val="586"/>
+        </w:trPr>
         <w:tc>
           <w:tcPr>
             <w:tcW w:w="10456" w:type="dxa"/>
@@ -152,9 +175,12 @@
         </w:tc>
       </w:tr>
       <w:tr>
+        <w:trPr>
+          <w:trHeight w:val="586"/>
+        </w:trPr>
         <w:tc>
           <w:tcPr>
-            <w:tcW w:w="3485" w:type="dxa"/>
+            <w:tcW w:w="2614" w:type="dxa"/>
             <w:vAlign w:val="center"/>
           </w:tcPr>
           <w:p>
@@ -172,10 +198,6 @@
           <w:p>
             <w:pPr>
               <w:jc w:val="center"/>
-              <w:rPr>
-                <w:b/>
-                <w:bCs/>
-              </w:rPr>
             </w:pPr>
             <w:r>
               <w:t>{</w:t>
@@ -183,10 +205,13 @@
             <w:proofErr w:type="spellStart"/>
             <w:proofErr w:type="gramStart"/>
             <w:r>
-              <w:t>heureArrivee</w:t>
+              <w:t>heure</w:t>
+            </w:r>
+            <w:proofErr w:type="gramEnd"/>
+            <w:r>
+              <w:t>_arrivee</w:t>
             </w:r>
             <w:proofErr w:type="spellEnd"/>
-            <w:proofErr w:type="gramEnd"/>
             <w:r>
               <w:t>}</w:t>
             </w:r>
@@ -194,8 +219,7 @@
         </w:tc>
         <w:tc>
           <w:tcPr>
-            <w:tcW w:w="3485" w:type="dxa"/>
-            <w:gridSpan w:val="2"/>
+            <w:tcW w:w="2614" w:type="dxa"/>
             <w:vAlign w:val="center"/>
           </w:tcPr>
           <w:p>
@@ -213,10 +237,6 @@
           <w:p>
             <w:pPr>
               <w:jc w:val="center"/>
-              <w:rPr>
-                <w:b/>
-                <w:bCs/>
-              </w:rPr>
             </w:pPr>
             <w:r>
               <w:t>{</w:t>
@@ -224,10 +244,13 @@
             <w:proofErr w:type="spellStart"/>
             <w:proofErr w:type="gramStart"/>
             <w:r>
-              <w:t>heureDepart</w:t>
+              <w:t>heure</w:t>
+            </w:r>
+            <w:proofErr w:type="gramEnd"/>
+            <w:r>
+              <w:t>_depart</w:t>
             </w:r>
             <w:proofErr w:type="spellEnd"/>
-            <w:proofErr w:type="gramEnd"/>
             <w:r>
               <w:t>}</w:t>
             </w:r>
@@ -235,7 +258,7 @@
         </w:tc>
         <w:tc>
           <w:tcPr>
-            <w:tcW w:w="3486" w:type="dxa"/>
+            <w:tcW w:w="2614" w:type="dxa"/>
             <w:vAlign w:val="center"/>
           </w:tcPr>
           <w:p>
@@ -256,10 +279,6 @@
           <w:p>
             <w:pPr>
               <w:jc w:val="center"/>
-              <w:rPr>
-                <w:b/>
-                <w:bCs/>
-              </w:rPr>
             </w:pPr>
             <w:r>
               <w:t>{</w:t>
@@ -267,21 +286,21 @@
             <w:proofErr w:type="spellStart"/>
             <w:proofErr w:type="gramStart"/>
             <w:r>
-              <w:t>delaiMinutes</w:t>
+              <w:t>delai</w:t>
+            </w:r>
+            <w:proofErr w:type="gramEnd"/>
+            <w:r>
+              <w:t>_minutes</w:t>
             </w:r>
             <w:proofErr w:type="spellEnd"/>
-            <w:proofErr w:type="gramEnd"/>
             <w:r>
               <w:t>}</w:t>
             </w:r>
           </w:p>
         </w:tc>
-      </w:tr>
-      <w:tr>
         <w:tc>
           <w:tcPr>
-            <w:tcW w:w="10456" w:type="dxa"/>
-            <w:gridSpan w:val="4"/>
+            <w:tcW w:w="2614" w:type="dxa"/>
             <w:vAlign w:val="center"/>
           </w:tcPr>
           <w:p>
@@ -293,14 +312,24 @@
               <w:t>Numéro du bon</w:t>
             </w:r>
             <w:r>
-              <w:t xml:space="preserve"> : </w:t>
-            </w:r>
+              <w:t xml:space="preserve"> :</w:t>
+            </w:r>
+          </w:p>
+          <w:p>
+            <w:pPr>
+              <w:jc w:val="center"/>
+            </w:pPr>
             <w:r>
               <w:t>{</w:t>
             </w:r>
             <w:proofErr w:type="spellStart"/>
-            <w:r>
-              <w:t>numeroBonIntervention</w:t>
+            <w:proofErr w:type="gramStart"/>
+            <w:r>
+              <w:t>numero</w:t>
+            </w:r>
+            <w:proofErr w:type="gramEnd"/>
+            <w:r>
+              <w:t>_bon</w:t>
             </w:r>
             <w:proofErr w:type="spellEnd"/>
             <w:r>
@@ -340,10 +369,13 @@
       <w:proofErr w:type="spellStart"/>
       <w:proofErr w:type="gramStart"/>
       <w:r>
-        <w:t>compteRendu</w:t>
+        <w:t>compte</w:t>
+      </w:r>
+      <w:proofErr w:type="gramEnd"/>
+      <w:r>
+        <w:t>_rendu</w:t>
       </w:r>
       <w:proofErr w:type="spellEnd"/>
-      <w:proofErr w:type="gramEnd"/>
       <w:r>
         <w:t>}</w:t>
       </w:r>
@@ -593,10 +625,48 @@
             <w:rPr>
               <w:b/>
               <w:bCs/>
-              <w:sz w:val="40"/>
-              <w:szCs w:val="40"/>
+              <w:sz w:val="36"/>
+              <w:szCs w:val="36"/>
             </w:rPr>
             <w:t>Compte rendu d’intervention</w:t>
+          </w:r>
+          <w:r>
+            <w:rPr>
+              <w:b/>
+              <w:bCs/>
+              <w:sz w:val="36"/>
+              <w:szCs w:val="36"/>
+            </w:rPr>
+            <w:t xml:space="preserve"> N°</w:t>
+          </w:r>
+          <w:r>
+            <w:rPr>
+              <w:b/>
+              <w:bCs/>
+              <w:sz w:val="36"/>
+              <w:szCs w:val="36"/>
+            </w:rPr>
+            <w:t>{</w:t>
+          </w:r>
+          <w:proofErr w:type="spellStart"/>
+          <w:r>
+            <w:rPr>
+              <w:b/>
+              <w:bCs/>
+              <w:sz w:val="36"/>
+              <w:szCs w:val="36"/>
+            </w:rPr>
+            <w:t>numeroFiche</w:t>
+          </w:r>
+          <w:proofErr w:type="spellEnd"/>
+          <w:r>
+            <w:rPr>
+              <w:b/>
+              <w:bCs/>
+              <w:sz w:val="36"/>
+              <w:szCs w:val="36"/>
+            </w:rPr>
+            <w:t>}</w:t>
           </w:r>
         </w:p>
       </w:tc>

</xml_diff>